<commit_message>
Update references after verification; add verification report
Co-Authored-By: Claude Sonnet 5.5 <noreply@anthropic.com>
Claude-Session: https://claude.ai/code/session_01GxnhmxUGY8a7A6BSHAY7ah
</commit_message>
<xml_diff>
--- a/isr_submission/ISR_Manuscript_Main.docx
+++ b/isr_submission/ISR_Manuscript_Main.docx
@@ -24160,7 +24160,7 @@
           <w:sz w:val="22"/>
           <w:szCs w:val="22"/>
         </w:rPr>
-        <w:t xml:space="preserve">.</w:t>
+        <w:t xml:space="preserve"> (ACM, New York), 79–90.</w:t>
       </w:r>
     </w:p>
     <w:p>
@@ -24520,7 +24520,7 @@
           <w:sz w:val="22"/>
           <w:szCs w:val="22"/>
         </w:rPr>
-        <w:t xml:space="preserve">Perez F, Ribeiro I. 2022. Ignore previous prompt: Attack techniques for language models. Preprint, submitted November 17, arXiv:2211.09527.</w:t>
+        <w:t xml:space="preserve">Perez F, Ribeiro I. 2022. Ignore previous prompt: Attack techniques for language models. Preprint, submitted November 17, arXiv:2211.09527. Presented at the ML Safety Workshop, NeurIPS 2022.</w:t>
       </w:r>
     </w:p>
     <w:p>
@@ -24619,7 +24619,7 @@
           <w:sz w:val="22"/>
           <w:szCs w:val="22"/>
         </w:rPr>
-        <w:t xml:space="preserve">.</w:t>
+        <w:t xml:space="preserve"> (ACM, New York), 1671–1685.</w:t>
       </w:r>
     </w:p>
     <w:p>

</xml_diff>